<commit_message>
Update syllabus processing scripts and documentation
</commit_message>
<xml_diff>
--- a/syllabus_books/R25_ECE_syllabus_co_blooms.docx
+++ b/syllabus_books/R25_ECE_syllabus_co_blooms.docx
@@ -101,49 +101,7 @@
               <w:jc w:val="left"/>
             </w:pPr>
             <w:r>
-              <w:t xml:space="preserve">Explain semiconductor energy band diagrams, carrier concentration</w:t>
-            </w:r>
-            <w:r>
-              <w:t xml:space="preserve"> </w:t>
-            </w:r>
-            <m:oMath>
-              <m:r>
-                <m:t>n</m:t>
-              </m:r>
-            </m:oMath>
-            <w:r>
-              <w:t xml:space="preserve">,</w:t>
-            </w:r>
-            <w:r>
-              <w:t xml:space="preserve"> </w:t>
-            </w:r>
-            <m:oMath>
-              <m:r>
-                <m:t>p</m:t>
-              </m:r>
-            </m:oMath>
-            <w:r>
-              <w:t xml:space="preserve">, and bandgap energy</w:t>
-            </w:r>
-            <w:r>
-              <w:t xml:space="preserve"> </w:t>
-            </w:r>
-            <m:oMath>
-              <m:sSub>
-                <m:e>
-                  <m:r>
-                    <m:t>E</m:t>
-                  </m:r>
-                </m:e>
-                <m:sub>
-                  <m:r>
-                    <m:t>g</m:t>
-                  </m:r>
-                </m:sub>
-              </m:sSub>
-            </m:oMath>
-            <w:r>
-              <w:t xml:space="preserve">.</w:t>
+              <w:t xml:space="preserve">Apply vector calculus concepts along with physical principles and properties to effectively solve problems encountered in everyday life, further study in science, and in the professional world related to electric field.</w:t>
             </w:r>
           </w:p>
         </w:tc>
@@ -201,99 +159,7 @@
               <w:jc w:val="left"/>
             </w:pPr>
             <w:r>
-              <w:t xml:space="preserve">Apply drift and diffusion equations</w:t>
-            </w:r>
-            <w:r>
-              <w:t xml:space="preserve"> </w:t>
-            </w:r>
-            <m:oMath>
-              <m:sSub>
-                <m:e>
-                  <m:r>
-                    <m:t>J</m:t>
-                  </m:r>
-                </m:e>
-                <m:sub>
-                  <m:r>
-                    <m:t>n</m:t>
-                  </m:r>
-                </m:sub>
-              </m:sSub>
-              <m:r>
-                <m:rPr>
-                  <m:sty m:val="p"/>
-                </m:rPr>
-                <m:t>=</m:t>
-              </m:r>
-              <m:r>
-                <m:t>q</m:t>
-              </m:r>
-              <m:r>
-                <m:t>n</m:t>
-              </m:r>
-              <m:sSub>
-                <m:e>
-                  <m:r>
-                    <m:t>μ</m:t>
-                  </m:r>
-                </m:e>
-                <m:sub>
-                  <m:r>
-                    <m:t>n</m:t>
-                  </m:r>
-                </m:sub>
-              </m:sSub>
-              <m:r>
-                <m:t>E</m:t>
-              </m:r>
-              <m:r>
-                <m:rPr>
-                  <m:sty m:val="p"/>
-                </m:rPr>
-                <m:t>+</m:t>
-              </m:r>
-              <m:r>
-                <m:t>q</m:t>
-              </m:r>
-              <m:sSub>
-                <m:e>
-                  <m:r>
-                    <m:t>D</m:t>
-                  </m:r>
-                </m:e>
-                <m:sub>
-                  <m:r>
-                    <m:t>n</m:t>
-                  </m:r>
-                </m:sub>
-              </m:sSub>
-              <m:f>
-                <m:fPr>
-                  <m:type m:val="bar"/>
-                </m:fPr>
-                <m:num>
-                  <m:r>
-                    <m:t>d</m:t>
-                  </m:r>
-                  <m:r>
-                    <m:t>n</m:t>
-                  </m:r>
-                </m:num>
-                <m:den>
-                  <m:r>
-                    <m:t>d</m:t>
-                  </m:r>
-                  <m:r>
-                    <m:t>x</m:t>
-                  </m:r>
-                </m:den>
-              </m:f>
-            </m:oMath>
-            <w:r>
-              <w:t xml:space="preserve"> </w:t>
-            </w:r>
-            <w:r>
-              <w:t xml:space="preserve">to analyze current flow.</w:t>
+              <w:t xml:space="preserve">Visualise the variations in Magnetic field by the knowledge gained from Ampere’s circuital law.</w:t>
             </w:r>
           </w:p>
         </w:tc>
@@ -317,7 +183,7 @@
               <w:jc w:val="left"/>
             </w:pPr>
             <w:r>
-              <w:t xml:space="preserve">K3 (CR)</w:t>
+              <w:t xml:space="preserve">K2 (AP)</w:t>
             </w:r>
           </w:p>
         </w:tc>
@@ -351,92 +217,7 @@
               <w:jc w:val="left"/>
             </w:pPr>
             <w:r>
-              <w:t xml:space="preserve">Analyze carrier statistics using integrals of the form</w:t>
-            </w:r>
-            <w:r>
-              <w:t xml:space="preserve"> </w:t>
-            </w:r>
-            <m:oMath>
-              <m:nary>
-                <m:naryPr>
-                  <m:chr m:val="∫"/>
-                  <m:limLoc m:val="subSup"/>
-                  <m:subHide m:val="off"/>
-                  <m:supHide m:val="off"/>
-                </m:naryPr>
-                <m:sub>
-                  <m:sSub>
-                    <m:e>
-                      <m:r>
-                        <m:t>E</m:t>
-                      </m:r>
-                    </m:e>
-                    <m:sub>
-                      <m:r>
-                        <m:t>c</m:t>
-                      </m:r>
-                    </m:sub>
-                  </m:sSub>
-                </m:sub>
-                <m:sup>
-                  <m:r>
-                    <m:rPr>
-                      <m:sty m:val="p"/>
-                    </m:rPr>
-                    <m:t>∞</m:t>
-                  </m:r>
-                </m:sup>
-                <m:e>
-                  <m:r>
-                    <m:t>g</m:t>
-                  </m:r>
-                </m:e>
-              </m:nary>
-              <m:r>
-                <m:rPr>
-                  <m:sty m:val="p"/>
-                </m:rPr>
-                <m:t>(</m:t>
-              </m:r>
-              <m:r>
-                <m:t>E</m:t>
-              </m:r>
-              <m:r>
-                <m:rPr>
-                  <m:sty m:val="p"/>
-                </m:rPr>
-                <m:t>)</m:t>
-              </m:r>
-              <m:r>
-                <m:t>f</m:t>
-              </m:r>
-              <m:r>
-                <m:rPr>
-                  <m:sty m:val="p"/>
-                </m:rPr>
-                <m:t>(</m:t>
-              </m:r>
-              <m:r>
-                <m:t>E</m:t>
-              </m:r>
-              <m:r>
-                <m:rPr>
-                  <m:sty m:val="p"/>
-                </m:rPr>
-                <m:t>)</m:t>
-              </m:r>
-              <m:r>
-                <m:t> </m:t>
-              </m:r>
-              <m:r>
-                <m:t>d</m:t>
-              </m:r>
-              <m:r>
-                <m:t>E</m:t>
-              </m:r>
-            </m:oMath>
-            <w:r>
-              <w:t xml:space="preserve">.</w:t>
+              <w:t xml:space="preserve">Interpret phasor Maxwell’s equations in differential and integral forms, in time domain from the electrodynamics concept.</w:t>
             </w:r>
           </w:p>
         </w:tc>
@@ -460,7 +241,7 @@
               <w:jc w:val="left"/>
             </w:pPr>
             <w:r>
-              <w:t xml:space="preserve">K1 (RE)</w:t>
+              <w:t xml:space="preserve">K2 (AP)</w:t>
             </w:r>
           </w:p>
         </w:tc>
@@ -494,60 +275,7 @@
               <w:jc w:val="left"/>
             </w:pPr>
             <w:r>
-              <w:t xml:space="preserve">Solve electrostatic field problems using Poisson’s equation</w:t>
-            </w:r>
-            <w:r>
-              <w:t xml:space="preserve"> </w:t>
-            </w:r>
-            <m:oMath>
-              <m:sSup>
-                <m:e>
-                  <m:r>
-                    <m:rPr>
-                      <m:sty m:val="p"/>
-                    </m:rPr>
-                    <m:t>∇</m:t>
-                  </m:r>
-                </m:e>
-                <m:sup>
-                  <m:r>
-                    <m:t>2</m:t>
-                  </m:r>
-                </m:sup>
-              </m:sSup>
-              <m:r>
-                <m:t>V</m:t>
-              </m:r>
-              <m:r>
-                <m:rPr>
-                  <m:sty m:val="p"/>
-                </m:rPr>
-                <m:t>=</m:t>
-              </m:r>
-              <m:r>
-                <m:rPr>
-                  <m:sty m:val="p"/>
-                </m:rPr>
-                <m:t>−</m:t>
-              </m:r>
-              <m:f>
-                <m:fPr>
-                  <m:type m:val="bar"/>
-                </m:fPr>
-                <m:num>
-                  <m:r>
-                    <m:t>ρ</m:t>
-                  </m:r>
-                </m:num>
-                <m:den>
-                  <m:r>
-                    <m:t>ε</m:t>
-                  </m:r>
-                </m:den>
-              </m:f>
-            </m:oMath>
-            <w:r>
-              <w:t xml:space="preserve">.</w:t>
+              <w:t xml:space="preserve">Analyse the boundary conditions between the two different mediums in the magnetic field and apply the concepts of uniform plane wave propagation for the time varying electric and magnetic fields.</w:t>
             </w:r>
           </w:p>
         </w:tc>
@@ -571,7 +299,7 @@
               <w:jc w:val="left"/>
             </w:pPr>
             <w:r>
-              <w:t xml:space="preserve">K1 (UN)</w:t>
+              <w:t xml:space="preserve">K2 (AP)</w:t>
             </w:r>
           </w:p>
         </w:tc>
@@ -605,96 +333,7 @@
               <w:jc w:val="left"/>
             </w:pPr>
             <w:r>
-              <w:t xml:space="preserve">Evaluate temperature-dependent behavior using</w:t>
-            </w:r>
-            <w:r>
-              <w:t xml:space="preserve"> </w:t>
-            </w:r>
-            <m:oMath>
-              <m:sSub>
-                <m:e>
-                  <m:r>
-                    <m:t>n</m:t>
-                  </m:r>
-                </m:e>
-                <m:sub>
-                  <m:r>
-                    <m:t>i</m:t>
-                  </m:r>
-                </m:sub>
-              </m:sSub>
-              <m:r>
-                <m:rPr>
-                  <m:sty m:val="p"/>
-                </m:rPr>
-                <m:t>∝</m:t>
-              </m:r>
-              <m:sSup>
-                <m:e>
-                  <m:r>
-                    <m:t>T</m:t>
-                  </m:r>
-                </m:e>
-                <m:sup>
-                  <m:r>
-                    <m:t>3</m:t>
-                  </m:r>
-                  <m:r>
-                    <m:rPr>
-                      <m:sty m:val="p"/>
-                    </m:rPr>
-                    <m:t>/</m:t>
-                  </m:r>
-                  <m:r>
-                    <m:t>2</m:t>
-                  </m:r>
-                </m:sup>
-              </m:sSup>
-              <m:sSup>
-                <m:e>
-                  <m:r>
-                    <m:t>e</m:t>
-                  </m:r>
-                </m:e>
-                <m:sup>
-                  <m:r>
-                    <m:rPr>
-                      <m:sty m:val="p"/>
-                    </m:rPr>
-                    <m:t>−</m:t>
-                  </m:r>
-                  <m:sSub>
-                    <m:e>
-                      <m:r>
-                        <m:t>E</m:t>
-                      </m:r>
-                    </m:e>
-                    <m:sub>
-                      <m:r>
-                        <m:t>g</m:t>
-                      </m:r>
-                    </m:sub>
-                  </m:sSub>
-                  <m:r>
-                    <m:rPr>
-                      <m:sty m:val="p"/>
-                    </m:rPr>
-                    <m:t>/</m:t>
-                  </m:r>
-                  <m:r>
-                    <m:t>2</m:t>
-                  </m:r>
-                  <m:r>
-                    <m:t>k</m:t>
-                  </m:r>
-                  <m:r>
-                    <m:t>T</m:t>
-                  </m:r>
-                </m:sup>
-              </m:sSup>
-            </m:oMath>
-            <w:r>
-              <w:t xml:space="preserve">.</w:t>
+              <w:t xml:space="preserve">Make appropriate trade-offs to achieve the most cost-effective sustainable design that meets all requirements with the knowledge gained on EMI/EMC due to EM waves.</w:t>
             </w:r>
           </w:p>
         </w:tc>
@@ -718,7 +357,7 @@
               <w:jc w:val="left"/>
             </w:pPr>
             <w:r>
-              <w:t xml:space="preserve">K2 (AN)</w:t>
+              <w:t xml:space="preserve">K2 (AP)</w:t>
             </w:r>
           </w:p>
         </w:tc>
@@ -740,43 +379,43 @@
               <w:jc w:val="left"/>
             </w:pPr>
             <w:r>
-              <w:t xml:space="preserve">ECE001.1</w:t>
-            </w:r>
-          </w:p>
-        </w:tc>
-        <w:tc>
-          <w:tcPr/>
-          <w:p>
-            <w:pPr>
-              <w:pStyle w:val="Compact"/>
-              <w:jc w:val="left"/>
-            </w:pPr>
-            <w:r>
-              <w:t xml:space="preserve">Explain the working principles of laboratory tools, sensors, and experimental setups used in practical implementations.</w:t>
-            </w:r>
-          </w:p>
-        </w:tc>
-        <w:tc>
-          <w:tcPr/>
-          <w:p>
-            <w:pPr>
-              <w:pStyle w:val="Compact"/>
-              <w:jc w:val="left"/>
-            </w:pPr>
-            <w:r>
-              <w:t xml:space="preserve">ECE001</w:t>
-            </w:r>
-          </w:p>
-        </w:tc>
-        <w:tc>
-          <w:tcPr/>
-          <w:p>
-            <w:pPr>
-              <w:pStyle w:val="Compact"/>
-              <w:jc w:val="left"/>
-            </w:pPr>
-            <w:r>
-              <w:t xml:space="preserve">K1 (UN)</w:t>
+              <w:t xml:space="preserve">ECE000.6</w:t>
+            </w:r>
+          </w:p>
+        </w:tc>
+        <w:tc>
+          <w:tcPr/>
+          <w:p>
+            <w:pPr>
+              <w:pStyle w:val="Compact"/>
+              <w:jc w:val="left"/>
+            </w:pPr>
+            <w:r>
+              <w:t xml:space="preserve">As a team acquire data from computer simulations to explore electromagnetic principles, effectively communicate the results, and critically evaluate the related engineering concepts, following the safety procedures and ethics in the laboratory.</w:t>
+            </w:r>
+          </w:p>
+        </w:tc>
+        <w:tc>
+          <w:tcPr/>
+          <w:p>
+            <w:pPr>
+              <w:pStyle w:val="Compact"/>
+              <w:jc w:val="left"/>
+            </w:pPr>
+            <w:r>
+              <w:t xml:space="preserve">ECE000</w:t>
+            </w:r>
+          </w:p>
+        </w:tc>
+        <w:tc>
+          <w:tcPr/>
+          <w:p>
+            <w:pPr>
+              <w:pStyle w:val="Compact"/>
+              <w:jc w:val="left"/>
+            </w:pPr>
+            <w:r>
+              <w:t xml:space="preserve">K2 (AP)</w:t>
             </w:r>
           </w:p>
         </w:tc>
@@ -798,19 +437,19 @@
               <w:jc w:val="left"/>
             </w:pPr>
             <w:r>
-              <w:t xml:space="preserve">ECE001.2</w:t>
-            </w:r>
-          </w:p>
-        </w:tc>
-        <w:tc>
-          <w:tcPr/>
-          <w:p>
-            <w:pPr>
-              <w:pStyle w:val="Compact"/>
-              <w:jc w:val="left"/>
-            </w:pPr>
-            <w:r>
-              <w:t xml:space="preserve">Apply appropriate measurement and data acquisition techniques to collect and preprocess experimental data accurately.</w:t>
+              <w:t xml:space="preserve">ECE001.1</w:t>
+            </w:r>
+          </w:p>
+        </w:tc>
+        <w:tc>
+          <w:tcPr/>
+          <w:p>
+            <w:pPr>
+              <w:pStyle w:val="Compact"/>
+              <w:jc w:val="left"/>
+            </w:pPr>
+            <w:r>
+              <w:t xml:space="preserve">To represent various dimensional signals mathematically in continuous and discrete form in time and frequency domain</w:t>
             </w:r>
           </w:p>
         </w:tc>
@@ -856,19 +495,19 @@
               <w:jc w:val="left"/>
             </w:pPr>
             <w:r>
-              <w:t xml:space="preserve">ECE001.3</w:t>
-            </w:r>
-          </w:p>
-        </w:tc>
-        <w:tc>
-          <w:tcPr/>
-          <w:p>
-            <w:pPr>
-              <w:pStyle w:val="Compact"/>
-              <w:jc w:val="left"/>
-            </w:pPr>
-            <w:r>
-              <w:t xml:space="preserve">Analyze the performance of implemented algorithms or systems using relevant metrics and experimental results.</w:t>
+              <w:t xml:space="preserve">ECE001.2</w:t>
+            </w:r>
+          </w:p>
+        </w:tc>
+        <w:tc>
+          <w:tcPr/>
+          <w:p>
+            <w:pPr>
+              <w:pStyle w:val="Compact"/>
+              <w:jc w:val="left"/>
+            </w:pPr>
+            <w:r>
+              <w:t xml:space="preserve">To design the FIR digital filters for various applications meeting the requirements</w:t>
             </w:r>
           </w:p>
         </w:tc>
@@ -892,7 +531,7 @@
               <w:jc w:val="left"/>
             </w:pPr>
             <w:r>
-              <w:t xml:space="preserve">K2 (AN)</w:t>
+              <w:t xml:space="preserve">K2 (AP)</w:t>
             </w:r>
           </w:p>
         </w:tc>
@@ -914,19 +553,19 @@
               <w:jc w:val="left"/>
             </w:pPr>
             <w:r>
-              <w:t xml:space="preserve">ECE001.4</w:t>
-            </w:r>
-          </w:p>
-        </w:tc>
-        <w:tc>
-          <w:tcPr/>
-          <w:p>
-            <w:pPr>
-              <w:pStyle w:val="Compact"/>
-              <w:jc w:val="left"/>
-            </w:pPr>
-            <w:r>
-              <w:t xml:space="preserve">Develop and document a complete practical solution by integrating experimentation, analysis, and reporting.</w:t>
+              <w:t xml:space="preserve">ECE001.3</w:t>
+            </w:r>
+          </w:p>
+        </w:tc>
+        <w:tc>
+          <w:tcPr/>
+          <w:p>
+            <w:pPr>
+              <w:pStyle w:val="Compact"/>
+              <w:jc w:val="left"/>
+            </w:pPr>
+            <w:r>
+              <w:t xml:space="preserve">To design the IIR digital filters for various applications meeting the requirements</w:t>
             </w:r>
           </w:p>
         </w:tc>
@@ -972,43 +611,43 @@
               <w:jc w:val="left"/>
             </w:pPr>
             <w:r>
-              <w:t xml:space="preserve">ECE002.1</w:t>
-            </w:r>
-          </w:p>
-        </w:tc>
-        <w:tc>
-          <w:tcPr/>
-          <w:p>
-            <w:pPr>
-              <w:pStyle w:val="Compact"/>
-              <w:jc w:val="left"/>
-            </w:pPr>
-            <w:r>
-              <w:t xml:space="preserve">Explain the concept of energy bands in solids.</w:t>
-            </w:r>
-          </w:p>
-        </w:tc>
-        <w:tc>
-          <w:tcPr/>
-          <w:p>
-            <w:pPr>
-              <w:pStyle w:val="Compact"/>
-              <w:jc w:val="left"/>
-            </w:pPr>
-            <w:r>
-              <w:t xml:space="preserve">ECE002</w:t>
-            </w:r>
-          </w:p>
-        </w:tc>
-        <w:tc>
-          <w:tcPr/>
-          <w:p>
-            <w:pPr>
-              <w:pStyle w:val="Compact"/>
-              <w:jc w:val="left"/>
-            </w:pPr>
-            <w:r>
-              <w:t xml:space="preserve">K1 (UN)</w:t>
+              <w:t xml:space="preserve">ECE001.4</w:t>
+            </w:r>
+          </w:p>
+        </w:tc>
+        <w:tc>
+          <w:tcPr/>
+          <w:p>
+            <w:pPr>
+              <w:pStyle w:val="Compact"/>
+              <w:jc w:val="left"/>
+            </w:pPr>
+            <w:r>
+              <w:t xml:space="preserve">To design frequency domain filters and spatial filters for image enhancement</w:t>
+            </w:r>
+          </w:p>
+        </w:tc>
+        <w:tc>
+          <w:tcPr/>
+          <w:p>
+            <w:pPr>
+              <w:pStyle w:val="Compact"/>
+              <w:jc w:val="left"/>
+            </w:pPr>
+            <w:r>
+              <w:t xml:space="preserve">ECE001</w:t>
+            </w:r>
+          </w:p>
+        </w:tc>
+        <w:tc>
+          <w:tcPr/>
+          <w:p>
+            <w:pPr>
+              <w:pStyle w:val="Compact"/>
+              <w:jc w:val="left"/>
+            </w:pPr>
+            <w:r>
+              <w:t xml:space="preserve">K2 (AP)</w:t>
             </w:r>
           </w:p>
         </w:tc>
@@ -1030,66 +669,43 @@
               <w:jc w:val="left"/>
             </w:pPr>
             <w:r>
-              <w:t xml:space="preserve">ECE002.2</w:t>
-            </w:r>
-          </w:p>
-        </w:tc>
-        <w:tc>
-          <w:tcPr/>
-          <w:p>
-            <w:pPr>
-              <w:pStyle w:val="Compact"/>
-              <w:jc w:val="left"/>
-            </w:pPr>
-            <w:r>
-              <w:t xml:space="preserve">Analyze bandgap energy</w:t>
-            </w:r>
-            <w:r>
-              <w:t xml:space="preserve"> </w:t>
-            </w:r>
-            <m:oMath>
-              <m:sSub>
-                <m:e>
-                  <m:r>
-                    <m:t>E</m:t>
-                  </m:r>
-                </m:e>
-                <m:sub>
-                  <m:r>
-                    <m:t>g</m:t>
-                  </m:r>
-                </m:sub>
-              </m:sSub>
-            </m:oMath>
-            <w:r>
-              <w:t xml:space="preserve"> </w:t>
-            </w:r>
-            <w:r>
-              <w:t xml:space="preserve">variation with temperature.</w:t>
-            </w:r>
-          </w:p>
-        </w:tc>
-        <w:tc>
-          <w:tcPr/>
-          <w:p>
-            <w:pPr>
-              <w:pStyle w:val="Compact"/>
-              <w:jc w:val="left"/>
-            </w:pPr>
-            <w:r>
-              <w:t xml:space="preserve">ECE002</w:t>
-            </w:r>
-          </w:p>
-        </w:tc>
-        <w:tc>
-          <w:tcPr/>
-          <w:p>
-            <w:pPr>
-              <w:pStyle w:val="Compact"/>
-              <w:jc w:val="left"/>
-            </w:pPr>
-            <w:r>
-              <w:t xml:space="preserve">K2 (AN)</w:t>
+              <w:t xml:space="preserve">ECE001.5</w:t>
+            </w:r>
+          </w:p>
+        </w:tc>
+        <w:tc>
+          <w:tcPr/>
+          <w:p>
+            <w:pPr>
+              <w:pStyle w:val="Compact"/>
+              <w:jc w:val="left"/>
+            </w:pPr>
+            <w:r>
+              <w:t xml:space="preserve">To analyse the methodologies for image restoration, image segmentation and image compression</w:t>
+            </w:r>
+          </w:p>
+        </w:tc>
+        <w:tc>
+          <w:tcPr/>
+          <w:p>
+            <w:pPr>
+              <w:pStyle w:val="Compact"/>
+              <w:jc w:val="left"/>
+            </w:pPr>
+            <w:r>
+              <w:t xml:space="preserve">ECE001</w:t>
+            </w:r>
+          </w:p>
+        </w:tc>
+        <w:tc>
+          <w:tcPr/>
+          <w:p>
+            <w:pPr>
+              <w:pStyle w:val="Compact"/>
+              <w:jc w:val="left"/>
+            </w:pPr>
+            <w:r>
+              <w:t xml:space="preserve">K2 (AP)</w:t>
             </w:r>
           </w:p>
         </w:tc>
@@ -1111,170 +727,43 @@
               <w:jc w:val="left"/>
             </w:pPr>
             <w:r>
-              <w:t xml:space="preserve">ECE002.3</w:t>
-            </w:r>
-          </w:p>
-        </w:tc>
-        <w:tc>
-          <w:tcPr/>
-          <w:p>
-            <w:pPr>
-              <w:pStyle w:val="Compact"/>
-              <w:jc w:val="left"/>
-            </w:pPr>
-            <w:r>
-              <w:t xml:space="preserve">Explain low-level injection effects in semiconductor materials.</w:t>
-            </w:r>
-          </w:p>
-        </w:tc>
-        <w:tc>
-          <w:tcPr/>
-          <w:p>
-            <w:pPr>
-              <w:pStyle w:val="Compact"/>
-              <w:jc w:val="left"/>
-            </w:pPr>
-            <w:r>
-              <w:t xml:space="preserve">ECE002</w:t>
-            </w:r>
-          </w:p>
-        </w:tc>
-        <w:tc>
-          <w:tcPr/>
-          <w:p>
-            <w:pPr>
-              <w:pStyle w:val="Compact"/>
-              <w:jc w:val="left"/>
-            </w:pPr>
-            <w:r>
-              <w:t xml:space="preserve">K3 (EV)</w:t>
-            </w:r>
-          </w:p>
-        </w:tc>
-        <w:tc>
-          <w:tcPr/>
-          <w:p>
-            <w:pPr>
-              <w:pStyle w:val="Compact"/>
-            </w:pPr>
-          </w:p>
-        </w:tc>
-      </w:tr>
-      <w:tr>
-        <w:tc>
-          <w:tcPr/>
-          <w:p>
-            <w:pPr>
-              <w:pStyle w:val="Compact"/>
-              <w:jc w:val="left"/>
-            </w:pPr>
-            <w:r>
-              <w:t xml:space="preserve">ECE002.4</w:t>
-            </w:r>
-          </w:p>
-        </w:tc>
-        <w:tc>
-          <w:tcPr/>
-          <w:p>
-            <w:pPr>
-              <w:pStyle w:val="Compact"/>
-              <w:jc w:val="left"/>
-            </w:pPr>
-            <w:r>
-              <w:t xml:space="preserve">Analyze</w:t>
-            </w:r>
-            <w:r>
-              <w:t xml:space="preserve"> </w:t>
-            </w:r>
-            <m:oMath>
-              <m:r>
-                <m:t>α</m:t>
-              </m:r>
-            </m:oMath>
-            <w:r>
-              <w:t xml:space="preserve">-particle induced defects in silicon.</w:t>
-            </w:r>
-          </w:p>
-        </w:tc>
-        <w:tc>
-          <w:tcPr/>
-          <w:p>
-            <w:pPr>
-              <w:pStyle w:val="Compact"/>
-              <w:jc w:val="left"/>
-            </w:pPr>
-            <w:r>
-              <w:t xml:space="preserve">ECE002</w:t>
-            </w:r>
-          </w:p>
-        </w:tc>
-        <w:tc>
-          <w:tcPr/>
-          <w:p>
-            <w:pPr>
-              <w:pStyle w:val="Compact"/>
-              <w:jc w:val="left"/>
-            </w:pPr>
-            <w:r>
-              <w:t xml:space="preserve">K3 (CR)</w:t>
-            </w:r>
-          </w:p>
-        </w:tc>
-        <w:tc>
-          <w:tcPr/>
-          <w:p>
-            <w:pPr>
-              <w:pStyle w:val="Compact"/>
-            </w:pPr>
-          </w:p>
-        </w:tc>
-      </w:tr>
-      <w:tr>
-        <w:tc>
-          <w:tcPr/>
-          <w:p>
-            <w:pPr>
-              <w:pStyle w:val="Compact"/>
-              <w:jc w:val="left"/>
-            </w:pPr>
-            <w:r>
-              <w:t xml:space="preserve">ECE002.5</w:t>
-            </w:r>
-          </w:p>
-        </w:tc>
-        <w:tc>
-          <w:tcPr/>
-          <w:p>
-            <w:pPr>
-              <w:pStyle w:val="Compact"/>
-              <w:jc w:val="left"/>
-            </w:pPr>
-            <w:r>
-              <w:t xml:space="preserve">Evaluate the impact of device scaling on carrier mobility.</w:t>
-            </w:r>
-          </w:p>
-        </w:tc>
-        <w:tc>
-          <w:tcPr/>
-          <w:p>
-            <w:pPr>
-              <w:pStyle w:val="Compact"/>
-              <w:jc w:val="left"/>
-            </w:pPr>
-            <w:r>
-              <w:t xml:space="preserve">ECE002</w:t>
-            </w:r>
-          </w:p>
-        </w:tc>
-        <w:tc>
-          <w:tcPr/>
-          <w:p>
-            <w:pPr>
-              <w:pStyle w:val="Compact"/>
-              <w:jc w:val="left"/>
-            </w:pPr>
-            <w:r>
-              <w:t xml:space="preserve">K1 (RE)</w:t>
+              <w:t xml:space="preserve">ECE001.6</w:t>
+            </w:r>
+          </w:p>
+        </w:tc>
+        <w:tc>
+          <w:tcPr/>
+          <w:p>
+            <w:pPr>
+              <w:pStyle w:val="Compact"/>
+              <w:jc w:val="left"/>
+            </w:pPr>
+            <w:r>
+              <w:t xml:space="preserve">Work as part of a team and as individual effectively in designing the communication systems following the norms and ethics in practice</w:t>
+            </w:r>
+          </w:p>
+        </w:tc>
+        <w:tc>
+          <w:tcPr/>
+          <w:p>
+            <w:pPr>
+              <w:pStyle w:val="Compact"/>
+              <w:jc w:val="left"/>
+            </w:pPr>
+            <w:r>
+              <w:t xml:space="preserve">ECE001</w:t>
+            </w:r>
+          </w:p>
+        </w:tc>
+        <w:tc>
+          <w:tcPr/>
+          <w:p>
+            <w:pPr>
+              <w:pStyle w:val="Compact"/>
+              <w:jc w:val="left"/>
+            </w:pPr>
+            <w:r>
+              <w:t xml:space="preserve">K2 (AP)</w:t>
             </w:r>
           </w:p>
         </w:tc>

</xml_diff>